<commit_message>
Add mission, vision, and values to the seller handbook.
Sellers get a clear brand section up front covering who DPM is, money rules, promises, and what the platform does and does not do.

Co-authored-by: Cursor <cursoragent@cursor.com>
</commit_message>
<xml_diff>
--- a/docs/legal/09_Seller_Handbook.docx
+++ b/docs/legal/09_Seller_Handbook.docx
@@ -109,7 +109,7 @@
           <w:i w:val="0"/>
           <w:sz w:val="22"/>
         </w:rPr>
-        <w:t>This guide explains, in plain language, how selling on DanyPathMart works day to day. It is written for shop owners who use the seller dashboard at https://danypathmart.store/seller.</w:t>
+        <w:t>This guide explains, in plain language, who DanyPathMart is, what we stand for, and how selling works day to day. It is written for shop owners who use the seller dashboard at https://danypathmart.store/seller.</w:t>
       </w:r>
     </w:p>
     <w:p>
@@ -118,7 +118,16 @@
           <w:i w:val="0"/>
           <w:sz w:val="22"/>
         </w:rPr>
-        <w:t>The legal rules you agreed to when you applied are in the Shop Seller Policy at /policies/shop-seller-policy. This handbook is the practical “how to” guide.</w:t>
+        <w:t>The legal rules you agreed to when you applied are in the Shop Seller Policy at /policies/shop-seller-policy. This handbook is the practical “how to” guide, plus our mission, vision, and values.</w:t>
+      </w:r>
+    </w:p>
+    <w:p>
+      <w:r>
+        <w:rPr>
+          <w:i w:val="0"/>
+          <w:sz w:val="22"/>
+        </w:rPr>
+        <w:t>Tagline: Your shop. Your sales. Our platform.</w:t>
       </w:r>
     </w:p>
     <w:p>
@@ -135,7 +144,7 @@
         <w:pStyle w:val="Heading2"/>
       </w:pPr>
       <w:r>
-        <w:t>1. What selling on DanyPathMart means</w:t>
+        <w:t>1. Mission, vision, and core values</w:t>
       </w:r>
     </w:p>
     <w:p>
@@ -144,7 +153,7 @@
           <w:i w:val="0"/>
           <w:sz w:val="22"/>
         </w:rPr>
-        <w:t>DanyPathMart (DPM) hosts your shop on our website. Customers find and buy your products through your own shop link.</w:t>
+        <w:t>Mission</w:t>
       </w:r>
     </w:p>
     <w:p>
@@ -153,7 +162,143 @@
           <w:i w:val="0"/>
           <w:sz w:val="22"/>
         </w:rPr>
-        <w:t>You keep 100% of the money from your product sales. DPM does not take a commission on those orders. What you pay DPM for is your shop subscription (registration and renewal), which keeps your public shop link open and visible.</w:t>
+        <w:t>DanyPathMart helps Ghanaian shops sell online with their own storefront link, while sellers keep 100% of product sales.</w:t>
+      </w:r>
+    </w:p>
+    <w:p>
+      <w:r>
+        <w:rPr>
+          <w:i w:val="0"/>
+          <w:sz w:val="22"/>
+        </w:rPr>
+        <w:t>Vision</w:t>
+      </w:r>
+    </w:p>
+    <w:p>
+      <w:r>
+        <w:rPr>
+          <w:i w:val="0"/>
+          <w:sz w:val="22"/>
+        </w:rPr>
+        <w:t>A Ghana where local shops sell online as easily as they sell in person — fairly, clearly, and on their own terms.</w:t>
+      </w:r>
+    </w:p>
+    <w:p>
+      <w:r>
+        <w:rPr>
+          <w:i w:val="0"/>
+          <w:sz w:val="22"/>
+        </w:rPr>
+        <w:t>Core values</w:t>
+      </w:r>
+    </w:p>
+    <w:p>
+      <w:pPr>
+        <w:pStyle w:val="ListBullet"/>
+      </w:pPr>
+      <w:r>
+        <w:t>Honesty — True prices, stock, photos, and delivery promises.</w:t>
+      </w:r>
+    </w:p>
+    <w:p>
+      <w:pPr>
+        <w:pStyle w:val="ListBullet"/>
+      </w:pPr>
+      <w:r>
+        <w:t>Reliability — Confirm payment, pack carefully, deliver or hand over as agreed, and keep order status up to date.</w:t>
+      </w:r>
+    </w:p>
+    <w:p>
+      <w:pPr>
+        <w:pStyle w:val="ListBullet"/>
+      </w:pPr>
+      <w:r>
+        <w:t>Ownership — Your shop, your sales money, and your reputation are yours.</w:t>
+      </w:r>
+    </w:p>
+    <w:p>
+      <w:pPr>
+        <w:pStyle w:val="ListBullet"/>
+      </w:pPr>
+      <w:r>
+        <w:t>Clarity — Plain rules and clear fees. Subscription keeps your link live; it is not a commission on sales.</w:t>
+      </w:r>
+    </w:p>
+    <w:p>
+      <w:pPr>
+        <w:pStyle w:val="ListBullet"/>
+      </w:pPr>
+      <w:r>
+        <w:t>Partnership — DPM hosts the platform and tools; you run the business and serve your customers.</w:t>
+      </w:r>
+    </w:p>
+    <w:p>
+      <w:pPr>
+        <w:pStyle w:val="ListBullet"/>
+      </w:pPr>
+      <w:r>
+        <w:t>Safety — No fake, illegal, counterfeit, or banned listings.</w:t>
+      </w:r>
+    </w:p>
+    <w:p>
+      <w:pPr>
+        <w:pStyle w:val="Heading2"/>
+      </w:pPr>
+      <w:r>
+        <w:t>2. Who we are</w:t>
+      </w:r>
+    </w:p>
+    <w:p>
+      <w:r>
+        <w:rPr>
+          <w:i w:val="0"/>
+          <w:sz w:val="22"/>
+        </w:rPr>
+        <w:t>DanyPathMart (DPM) is an online marketplace in Ghana focused on school supplies and related goods. We sell products directly as DPM on the main shop (/shop), and we also host independent shops on their own storefront links (/stores/your-shop-slug).</w:t>
+      </w:r>
+    </w:p>
+    <w:p>
+      <w:r>
+        <w:rPr>
+          <w:i w:val="0"/>
+          <w:sz w:val="22"/>
+        </w:rPr>
+        <w:t>Customers find your products through your shop link. You manage products, orders, chat, payments, and renewals from the seller dashboard.</w:t>
+      </w:r>
+    </w:p>
+    <w:p>
+      <w:pPr>
+        <w:pStyle w:val="Heading2"/>
+      </w:pPr>
+      <w:r>
+        <w:t>3. What we believe about money</w:t>
+      </w:r>
+    </w:p>
+    <w:p>
+      <w:r>
+        <w:rPr>
+          <w:i w:val="0"/>
+          <w:sz w:val="22"/>
+        </w:rPr>
+        <w:t>Customer buys your product → money goes to you (Paystack, MoMo, or cash).</w:t>
+      </w:r>
+    </w:p>
+    <w:p>
+      <w:r>
+        <w:rPr>
+          <w:i w:val="0"/>
+          <w:sz w:val="22"/>
+        </w:rPr>
+        <w:t>You pay DPM → only for shop registration or renewal subscription.</w:t>
+      </w:r>
+    </w:p>
+    <w:p>
+      <w:r>
+        <w:rPr>
+          <w:i w:val="0"/>
+          <w:sz w:val="22"/>
+        </w:rPr>
+        <w:t>DPM does not take a commission on shop product sales.</w:t>
       </w:r>
     </w:p>
     <w:p>
@@ -170,7 +315,286 @@
         <w:pStyle w:val="Heading2"/>
       </w:pPr>
       <w:r>
-        <w:t>2. Getting started — apply, invite, or approval</w:t>
+        <w:t>4. What DPM does — and does not do</w:t>
+      </w:r>
+    </w:p>
+    <w:p>
+      <w:r>
+        <w:rPr>
+          <w:i w:val="0"/>
+          <w:sz w:val="22"/>
+        </w:rPr>
+        <w:t>DPM does:</w:t>
+      </w:r>
+    </w:p>
+    <w:p>
+      <w:pPr>
+        <w:pStyle w:val="ListBullet"/>
+      </w:pPr>
+      <w:r>
+        <w:t>Host your public shop link and seller dashboard</w:t>
+      </w:r>
+    </w:p>
+    <w:p>
+      <w:pPr>
+        <w:pStyle w:val="ListBullet"/>
+      </w:pPr>
+      <w:r>
+        <w:t>Provide tools for products, orders, live chat, billing, and payment settings</w:t>
+      </w:r>
+    </w:p>
+    <w:p>
+      <w:pPr>
+        <w:pStyle w:val="ListBullet"/>
+      </w:pPr>
+      <w:r>
+        <w:t>Collect subscription / registration fees for the platform</w:t>
+      </w:r>
+    </w:p>
+    <w:p>
+      <w:pPr>
+        <w:pStyle w:val="ListBullet"/>
+      </w:pPr>
+      <w:r>
+        <w:t>Support platform issues (login, subscription payment to DPM, site bugs)</w:t>
+      </w:r>
+    </w:p>
+    <w:p>
+      <w:pPr>
+        <w:pStyle w:val="ListBullet"/>
+      </w:pPr>
+      <w:r>
+        <w:t>Enforce platform rules for trust and safety</w:t>
+      </w:r>
+    </w:p>
+    <w:p>
+      <w:r>
+        <w:rPr>
+          <w:i w:val="0"/>
+          <w:sz w:val="22"/>
+        </w:rPr>
+        <w:t>DPM does not:</w:t>
+      </w:r>
+    </w:p>
+    <w:p>
+      <w:pPr>
+        <w:pStyle w:val="ListBullet"/>
+      </w:pPr>
+      <w:r>
+        <w:t>Take a cut of your normal shop product sales</w:t>
+      </w:r>
+    </w:p>
+    <w:p>
+      <w:pPr>
+        <w:pStyle w:val="ListBullet"/>
+      </w:pPr>
+      <w:r>
+        <w:t>Hold your sales proceeds in a DPM wallet for ordinary shop checkout</w:t>
+      </w:r>
+    </w:p>
+    <w:p>
+      <w:pPr>
+        <w:pStyle w:val="ListBullet"/>
+      </w:pPr>
+      <w:r>
+        <w:t>Run courier delivery for your shop orders (you arrange delivery or pickup)</w:t>
+      </w:r>
+    </w:p>
+    <w:p>
+      <w:pPr>
+        <w:pStyle w:val="ListBullet"/>
+      </w:pPr>
+      <w:r>
+        <w:t>Replace your duty to register your own business, pay tax, or hold licences that apply to you</w:t>
+      </w:r>
+    </w:p>
+    <w:p>
+      <w:pPr>
+        <w:pStyle w:val="Heading2"/>
+      </w:pPr>
+      <w:r>
+        <w:t>5. Our seller promise</w:t>
+      </w:r>
+    </w:p>
+    <w:p>
+      <w:r>
+        <w:rPr>
+          <w:i w:val="0"/>
+          <w:sz w:val="22"/>
+        </w:rPr>
+        <w:t>When you sell on DanyPathMart, you commit to:</w:t>
+      </w:r>
+    </w:p>
+    <w:p>
+      <w:pPr>
+        <w:pStyle w:val="ListBullet"/>
+      </w:pPr>
+      <w:r>
+        <w:t>Use your own shop link for your products (not the main DPM /shop cart for your items)</w:t>
+      </w:r>
+    </w:p>
+    <w:p>
+      <w:pPr>
+        <w:pStyle w:val="ListBullet"/>
+      </w:pPr>
+      <w:r>
+        <w:t>Keep prices, stock, and descriptions honest</w:t>
+      </w:r>
+    </w:p>
+    <w:p>
+      <w:pPr>
+        <w:pStyle w:val="ListBullet"/>
+      </w:pPr>
+      <w:r>
+        <w:t>Turn on at least one way for customers to pay</w:t>
+      </w:r>
+    </w:p>
+    <w:p>
+      <w:pPr>
+        <w:pStyle w:val="ListBullet"/>
+      </w:pPr>
+      <w:r>
+        <w:t>Mark MoMo and cash orders as paid only after you have received the money</w:t>
+      </w:r>
+    </w:p>
+    <w:p>
+      <w:pPr>
+        <w:pStyle w:val="ListBullet"/>
+      </w:pPr>
+      <w:r>
+        <w:t>Update order status from Preparing → Out for delivery → Delivered</w:t>
+      </w:r>
+    </w:p>
+    <w:p>
+      <w:pPr>
+        <w:pStyle w:val="ListBullet"/>
+      </w:pPr>
+      <w:r>
+        <w:t>Keep a reachable customer service phone or WhatsApp number on your profile</w:t>
+      </w:r>
+    </w:p>
+    <w:p>
+      <w:pPr>
+        <w:pStyle w:val="ListBullet"/>
+      </w:pPr>
+      <w:r>
+        <w:t>Reply to customers promptly and professionally</w:t>
+      </w:r>
+    </w:p>
+    <w:p>
+      <w:pPr>
+        <w:pStyle w:val="ListBullet"/>
+      </w:pPr>
+      <w:r>
+        <w:t>Renew your subscription so your public link stays open</w:t>
+      </w:r>
+    </w:p>
+    <w:p>
+      <w:pPr>
+        <w:pStyle w:val="ListBullet"/>
+      </w:pPr>
+      <w:r>
+        <w:t>Follow the Shop Seller Policy and Acceptable Use Policy</w:t>
+      </w:r>
+    </w:p>
+    <w:p>
+      <w:pPr>
+        <w:pStyle w:val="Heading2"/>
+      </w:pPr>
+      <w:r>
+        <w:t>6. What customers should expect from DPM shops</w:t>
+      </w:r>
+    </w:p>
+    <w:p>
+      <w:r>
+        <w:rPr>
+          <w:i w:val="0"/>
+          <w:sz w:val="22"/>
+        </w:rPr>
+        <w:t>Buyers shopping on a DPM shop link should be able to expect:</w:t>
+      </w:r>
+    </w:p>
+    <w:p>
+      <w:pPr>
+        <w:pStyle w:val="ListBullet"/>
+      </w:pPr>
+      <w:r>
+        <w:t>Clear product photos, prices in GHS, and honest stock</w:t>
+      </w:r>
+    </w:p>
+    <w:p>
+      <w:pPr>
+        <w:pStyle w:val="ListBullet"/>
+      </w:pPr>
+      <w:r>
+        <w:t>A way to reach the shop (phone / WhatsApp and/or live chat)</w:t>
+      </w:r>
+    </w:p>
+    <w:p>
+      <w:pPr>
+        <w:pStyle w:val="ListBullet"/>
+      </w:pPr>
+      <w:r>
+        <w:t>Payment options the shop has enabled (Paystack, MoMo, and/or pay in person)</w:t>
+      </w:r>
+    </w:p>
+    <w:p>
+      <w:pPr>
+        <w:pStyle w:val="ListBullet"/>
+      </w:pPr>
+      <w:r>
+        <w:t>Order status updates after payment is confirmed</w:t>
+      </w:r>
+    </w:p>
+    <w:p>
+      <w:pPr>
+        <w:pStyle w:val="ListBullet"/>
+      </w:pPr>
+      <w:r>
+        <w:t>Delivery or pickup arranged clearly with the shop</w:t>
+      </w:r>
+    </w:p>
+    <w:p>
+      <w:r>
+        <w:rPr>
+          <w:i w:val="0"/>
+          <w:sz w:val="22"/>
+        </w:rPr>
+        <w:t>If something goes wrong on a shop order, the shop handles it first with the customer. Escalate to DPM under the Complaints &amp; Disputes Policy when needed.</w:t>
+      </w:r>
+    </w:p>
+    <w:p>
+      <w:pPr>
+        <w:pStyle w:val="Heading2"/>
+      </w:pPr>
+      <w:r>
+        <w:t>7. What selling on DanyPathMart means</w:t>
+      </w:r>
+    </w:p>
+    <w:p>
+      <w:r>
+        <w:rPr>
+          <w:i w:val="0"/>
+          <w:sz w:val="22"/>
+        </w:rPr>
+        <w:t>DanyPathMart hosts your shop on our website. Customers find and buy your products through your own shop link.</w:t>
+      </w:r>
+    </w:p>
+    <w:p>
+      <w:r>
+        <w:rPr>
+          <w:i w:val="0"/>
+          <w:sz w:val="22"/>
+        </w:rPr>
+        <w:t>You keep 100% of the money from your product sales. What you pay DPM for is your shop subscription (registration and renewal), which keeps your public shop link open and visible.</w:t>
+      </w:r>
+    </w:p>
+    <w:p>
+      <w:pPr>
+        <w:pStyle w:val="Heading2"/>
+      </w:pPr>
+      <w:r>
+        <w:t>8. Getting started — apply, invite, or approval</w:t>
       </w:r>
     </w:p>
     <w:p>
@@ -223,7 +647,7 @@
         <w:pStyle w:val="Heading2"/>
       </w:pPr>
       <w:r>
-        <w:t>3. Your shop link (this is the most important link)</w:t>
+        <w:t>9. Your shop link (this is the most important link)</w:t>
       </w:r>
     </w:p>
     <w:p>
@@ -276,7 +700,7 @@
         <w:pStyle w:val="Heading2"/>
       </w:pPr>
       <w:r>
-        <w:t>4. Seller dashboard — where everything lives</w:t>
+        <w:t>10. Seller dashboard — where everything lives</w:t>
       </w:r>
     </w:p>
     <w:p>
@@ -367,7 +791,7 @@
         <w:pStyle w:val="Heading2"/>
       </w:pPr>
       <w:r>
-        <w:t>5. Subscription and renewals</w:t>
+        <w:t>11. Subscription and renewals</w:t>
       </w:r>
     </w:p>
     <w:p>
@@ -411,7 +835,7 @@
         <w:pStyle w:val="Heading2"/>
       </w:pPr>
       <w:r>
-        <w:t>6. How customers pay you (Seller → Payments / Payouts)</w:t>
+        <w:t>12. How customers pay you (Seller → Payments / Payouts)</w:t>
       </w:r>
     </w:p>
     <w:p>
@@ -464,7 +888,7 @@
         <w:pStyle w:val="Heading2"/>
       </w:pPr>
       <w:r>
-        <w:t>7. Adding and managing products</w:t>
+        <w:t>13. Adding and managing products</w:t>
       </w:r>
     </w:p>
     <w:p>
@@ -517,7 +941,7 @@
         <w:pStyle w:val="Heading2"/>
       </w:pPr>
       <w:r>
-        <w:t>8. When an order arrives — step by step</w:t>
+        <w:t>14. When an order arrives — step by step</w:t>
       </w:r>
     </w:p>
     <w:p>
@@ -606,7 +1030,7 @@
         <w:pStyle w:val="Heading2"/>
       </w:pPr>
       <w:r>
-        <w:t>9. Delivery and shop pickup</w:t>
+        <w:t>15. Delivery and shop pickup</w:t>
       </w:r>
     </w:p>
     <w:p>
@@ -632,7 +1056,7 @@
         <w:pStyle w:val="Heading2"/>
       </w:pPr>
       <w:r>
-        <w:t>10. Unpaid orders and stock</w:t>
+        <w:t>16. Unpaid orders and stock</w:t>
       </w:r>
     </w:p>
     <w:p>
@@ -658,7 +1082,7 @@
         <w:pStyle w:val="Heading2"/>
       </w:pPr>
       <w:r>
-        <w:t>11. Talking to customers — phone and live chat</w:t>
+        <w:t>17. Talking to customers — phone and live chat</w:t>
       </w:r>
     </w:p>
     <w:p>
@@ -693,7 +1117,7 @@
         <w:pStyle w:val="Heading2"/>
       </w:pPr>
       <w:r>
-        <w:t>12. Sharing your shop and referring other sellers</w:t>
+        <w:t>18. Sharing your shop and referring other sellers</w:t>
       </w:r>
     </w:p>
     <w:p>
@@ -719,7 +1143,7 @@
         <w:pStyle w:val="Heading2"/>
       </w:pPr>
       <w:r>
-        <w:t>13. Storefront privacy modes</w:t>
+        <w:t>19. Storefront privacy modes</w:t>
       </w:r>
     </w:p>
     <w:p>
@@ -736,7 +1160,7 @@
         <w:pStyle w:val="Heading2"/>
       </w:pPr>
       <w:r>
-        <w:t>14. Trust, reports, and staying in good standing</w:t>
+        <w:t>20. Trust, reports, and staying in good standing</w:t>
       </w:r>
     </w:p>
     <w:p>
@@ -762,42 +1186,7 @@
         <w:pStyle w:val="Heading2"/>
       </w:pPr>
       <w:r>
-        <w:t>15. Money summary (easy version)</w:t>
-      </w:r>
-    </w:p>
-    <w:p>
-      <w:r>
-        <w:rPr>
-          <w:i w:val="0"/>
-          <w:sz w:val="22"/>
-        </w:rPr>
-        <w:t>Customer buys your product → money goes to you (Paystack / MoMo / cash).</w:t>
-      </w:r>
-    </w:p>
-    <w:p>
-      <w:r>
-        <w:rPr>
-          <w:i w:val="0"/>
-          <w:sz w:val="22"/>
-        </w:rPr>
-        <w:t>You pay DPM → only for shop registration or renewal subscription.</w:t>
-      </w:r>
-    </w:p>
-    <w:p>
-      <w:r>
-        <w:rPr>
-          <w:i w:val="0"/>
-          <w:sz w:val="22"/>
-        </w:rPr>
-        <w:t>DPM does not take a cut of your product sales on the shop storefront model.</w:t>
-      </w:r>
-    </w:p>
-    <w:p>
-      <w:pPr>
-        <w:pStyle w:val="Heading2"/>
-      </w:pPr>
-      <w:r>
-        <w:t>16. Quick checklist before you go live</w:t>
+        <w:t>21. Quick checklist before you go live</w:t>
       </w:r>
     </w:p>
     <w:p>
@@ -874,10 +1263,18 @@
     </w:p>
     <w:p>
       <w:pPr>
+        <w:pStyle w:val="ListBullet"/>
+      </w:pPr>
+      <w:r>
+        <w:t>☐ You have read the seller promise and core values above</w:t>
+      </w:r>
+    </w:p>
+    <w:p>
+      <w:pPr>
         <w:pStyle w:val="Heading2"/>
       </w:pPr>
       <w:r>
-        <w:t>17. Where to read more</w:t>
+        <w:t>22. Where to read more</w:t>
       </w:r>
     </w:p>
     <w:p>

</xml_diff>

<commit_message>
Frame DanyPathMart under DSD Groups with group vision, mission, and values.
Seller handbook and terms now state DPM is a DSD product company and use the official DSD Groups brand language.

Co-authored-by: Cursor <cursoragent@cursor.com>
</commit_message>
<xml_diff>
--- a/docs/legal/09_Seller_Handbook.docx
+++ b/docs/legal/09_Seller_Handbook.docx
@@ -109,7 +109,7 @@
           <w:i w:val="0"/>
           <w:sz w:val="22"/>
         </w:rPr>
-        <w:t>This guide explains, in plain language, who DanyPathMart is, what we stand for, and how selling works day to day. It is written for shop owners who use the seller dashboard at https://danypathmart.store/seller.</w:t>
+        <w:t>This guide explains, in plain language, who DanyPathMart is, what DSD Groups stands for, and how selling works day to day. It is written for shop owners who use the seller dashboard at https://danypathmart.store/seller.</w:t>
       </w:r>
     </w:p>
     <w:p>
@@ -118,7 +118,7 @@
           <w:i w:val="0"/>
           <w:sz w:val="22"/>
         </w:rPr>
-        <w:t>The legal rules you agreed to when you applied are in the Shop Seller Policy at /policies/shop-seller-policy. This handbook is the practical “how to” guide, plus our mission, vision, and values.</w:t>
+        <w:t>The legal rules you agreed to when you applied are in the Shop Seller Policy at /policies/shop-seller-policy. This handbook is the practical “how to” guide, plus the group mission, vision, and values.</w:t>
       </w:r>
     </w:p>
     <w:p>
@@ -144,7 +144,34 @@
         <w:pStyle w:val="Heading2"/>
       </w:pPr>
       <w:r>
-        <w:t>1. Mission, vision, and core values</w:t>
+        <w:t>1. DSD Groups — vision, mission, and core values</w:t>
+      </w:r>
+    </w:p>
+    <w:p>
+      <w:r>
+        <w:rPr>
+          <w:i w:val="0"/>
+          <w:sz w:val="22"/>
+        </w:rPr>
+        <w:t>DanyPathMart (DPM) is a product company under DSD Groups. The vision, mission, and values below belong to DSD Groups and guide every product we build, including DPM.</w:t>
+      </w:r>
+    </w:p>
+    <w:p>
+      <w:r>
+        <w:rPr>
+          <w:i w:val="0"/>
+          <w:sz w:val="22"/>
+        </w:rPr>
+        <w:t>Vision</w:t>
+      </w:r>
+    </w:p>
+    <w:p>
+      <w:r>
+        <w:rPr>
+          <w:i w:val="0"/>
+          <w:sz w:val="22"/>
+        </w:rPr>
+        <w:t>To build a family of software products that power everyday life — commerce, services, and opportunity — for the people traditional tech leaves behind.</w:t>
       </w:r>
     </w:p>
     <w:p>
@@ -162,25 +189,7 @@
           <w:i w:val="0"/>
           <w:sz w:val="22"/>
         </w:rPr>
-        <w:t>DanyPathMart helps Ghanaian shops sell online with their own storefront link, while sellers keep 100% of product sales.</w:t>
-      </w:r>
-    </w:p>
-    <w:p>
-      <w:r>
-        <w:rPr>
-          <w:i w:val="0"/>
-          <w:sz w:val="22"/>
-        </w:rPr>
-        <w:t>Vision</w:t>
-      </w:r>
-    </w:p>
-    <w:p>
-      <w:r>
-        <w:rPr>
-          <w:i w:val="0"/>
-          <w:sz w:val="22"/>
-        </w:rPr>
-        <w:t>A Ghana where local shops sell online as easily as they sell in person — fairly, clearly, and on their own terms.</w:t>
+        <w:t>We find the problems ordinary people face and solve them with sharp, affordable software — expanding access wherever technology underserves them.</w:t>
       </w:r>
     </w:p>
     <w:p>
@@ -197,7 +206,7 @@
         <w:pStyle w:val="ListBullet"/>
       </w:pPr>
       <w:r>
-        <w:t>Honesty — True prices, stock, photos, and delivery promises.</w:t>
+        <w:t>Problem-solving — we build for real problems, not trends</w:t>
       </w:r>
     </w:p>
     <w:p>
@@ -205,7 +214,7 @@
         <w:pStyle w:val="ListBullet"/>
       </w:pPr>
       <w:r>
-        <w:t>Reliability — Confirm payment, pack carefully, deliver or hand over as agreed, and keep order status up to date.</w:t>
+        <w:t>Ownership — we take full responsibility for what we build</w:t>
       </w:r>
     </w:p>
     <w:p>
@@ -213,7 +222,7 @@
         <w:pStyle w:val="ListBullet"/>
       </w:pPr>
       <w:r>
-        <w:t>Ownership — Your shop, your sales money, and your reputation are yours.</w:t>
+        <w:t>Speed — we move fast and iterate faster than the problem changes</w:t>
       </w:r>
     </w:p>
     <w:p>
@@ -221,7 +230,7 @@
         <w:pStyle w:val="ListBullet"/>
       </w:pPr>
       <w:r>
-        <w:t>Clarity — Plain rules and clear fees. Subscription keeps your link live; it is not a commission on sales.</w:t>
+        <w:t>Trust — every product carries the DSD name</w:t>
       </w:r>
     </w:p>
     <w:p>
@@ -229,15 +238,7 @@
         <w:pStyle w:val="ListBullet"/>
       </w:pPr>
       <w:r>
-        <w:t>Partnership — DPM hosts the platform and tools; you run the business and serve your customers.</w:t>
-      </w:r>
-    </w:p>
-    <w:p>
-      <w:pPr>
-        <w:pStyle w:val="ListBullet"/>
-      </w:pPr>
-      <w:r>
-        <w:t>Safety — No fake, illegal, counterfeit, or banned listings.</w:t>
+        <w:t>Growth — for our users, our team, and the company</w:t>
       </w:r>
     </w:p>
     <w:p>
@@ -245,7 +246,7 @@
         <w:pStyle w:val="Heading2"/>
       </w:pPr>
       <w:r>
-        <w:t>2. Who we are</w:t>
+        <w:t>2. Who we are — DanyPathMart under DSD Groups</w:t>
       </w:r>
     </w:p>
     <w:p>
@@ -254,7 +255,16 @@
           <w:i w:val="0"/>
           <w:sz w:val="22"/>
         </w:rPr>
-        <w:t>DanyPathMart (DPM) is an online marketplace in Ghana focused on school supplies and related goods. We sell products directly as DPM on the main shop (/shop), and we also host independent shops on their own storefront links (/stores/your-shop-slug).</w:t>
+        <w:t>DSD Groups builds software products for everyday life. DanyPathMart is one of those products: an online marketplace in Ghana focused on school supplies and related goods, built so local shops and customers are not left behind by traditional tech.</w:t>
+      </w:r>
+    </w:p>
+    <w:p>
+      <w:r>
+        <w:rPr>
+          <w:i w:val="0"/>
+          <w:sz w:val="22"/>
+        </w:rPr>
+        <w:t>On DPM we sell products directly as DanyPathMart on the main shop (/shop), and we also host independent shops on their own storefront links (/stores/your-shop-slug).</w:t>
       </w:r>
     </w:p>
     <w:p>
@@ -264,6 +274,15 @@
           <w:sz w:val="22"/>
         </w:rPr>
         <w:t>Customers find your products through your shop link. You manage products, orders, chat, payments, and renewals from the seller dashboard.</w:t>
+      </w:r>
+    </w:p>
+    <w:p>
+      <w:r>
+        <w:rPr>
+          <w:i w:val="0"/>
+          <w:sz w:val="22"/>
+        </w:rPr>
+        <w:t>In short: DSD Groups is the parent; DanyPathMart is the commerce product you sell on.</w:t>
       </w:r>
     </w:p>
     <w:p>

</xml_diff>